<commit_message>
Replace all lingering standalone references from Copilot to Navigator
</commit_message>
<xml_diff>
--- a/Report-2-Crypto-Agility-Navigator.docx
+++ b/Report-2-Crypto-Agility-Navigator.docx
@@ -3888,7 +3888,7 @@
           <w:rStyle w:val="VerbatimChar"/>
           <w:rFonts w:ascii="Consolas" w:hAnsi="Consolas"/>
         </w:rPr>
-        <w:t xml:space="preserve"> Stakeholder Class      Primary Pain Point               Copilot Solution             </w:t>
+        <w:t xml:space="preserve"> Stakeholder Class      Primary Pain Point               Navigator Solution             </w:t>
       </w:r>
     </w:p>
     <w:p>
@@ -4314,7 +4314,7 @@
         <w:pStyle w:val="BodyText"/>
       </w:pPr>
       <w:r>
-        <w:t xml:space="preserve">The copilot enforces compliance with:</w:t>
+        <w:t xml:space="preserve">The navigator enforces compliance with:</w:t>
       </w:r>
     </w:p>
     <w:p>
@@ -7797,91 +7797,91 @@
           <w:rStyle w:val="VerbatimChar"/>
           <w:rFonts w:ascii="Consolas" w:hAnsi="Consolas"/>
         </w:rPr>
-        <w:t xml:space="preserve">test_cbom_generation (test_navigator.TestCryptoAgilityCopilot.test_cbom_generation) ... ok</w:t>
-      </w:r>
-    </w:p>
-    <w:p>
-      <w:pPr>
-        <w:pStyle w:val="SourceCode"/>
-      </w:pPr>
-      <w:r>
-        <w:rPr>
-          <w:rStyle w:val="VerbatimChar"/>
-          <w:rFonts w:ascii="Consolas" w:hAnsi="Consolas"/>
-        </w:rPr>
-        <w:t xml:space="preserve">test_context_noise_suppression (test_navigator.TestCryptoAgilityCopilot.test_context_noise_suppression) ... ok</w:t>
-      </w:r>
-    </w:p>
-    <w:p>
-      <w:pPr>
-        <w:pStyle w:val="SourceCode"/>
-      </w:pPr>
-      <w:r>
-        <w:rPr>
-          <w:rStyle w:val="VerbatimChar"/>
-          <w:rFonts w:ascii="Consolas" w:hAnsi="Consolas"/>
-        </w:rPr>
-        <w:t xml:space="preserve">test_custom_code_snippet_analysis (test_navigator.TestCryptoAgilityCopilot.test_custom_code_snippet_analysis) ... ok</w:t>
-      </w:r>
-    </w:p>
-    <w:p>
-      <w:pPr>
-        <w:pStyle w:val="SourceCode"/>
-      </w:pPr>
-      <w:r>
-        <w:rPr>
-          <w:rStyle w:val="VerbatimChar"/>
-          <w:rFonts w:ascii="Consolas" w:hAnsi="Consolas"/>
-        </w:rPr>
-        <w:t xml:space="preserve">test_discovery_engine (test_navigator.TestCryptoAgilityCopilot.test_discovery_engine) ... ok</w:t>
-      </w:r>
-    </w:p>
-    <w:p>
-      <w:pPr>
-        <w:pStyle w:val="SourceCode"/>
-      </w:pPr>
-      <w:r>
-        <w:rPr>
-          <w:rStyle w:val="VerbatimChar"/>
-          <w:rFonts w:ascii="Consolas" w:hAnsi="Consolas"/>
-        </w:rPr>
-        <w:t xml:space="preserve">test_full_pipeline_ranking (test_navigator.TestCryptoAgilityCopilot.test_full_pipeline_ranking) ... ok</w:t>
-      </w:r>
-    </w:p>
-    <w:p>
-      <w:pPr>
-        <w:pStyle w:val="SourceCode"/>
-      </w:pPr>
-      <w:r>
-        <w:rPr>
-          <w:rStyle w:val="VerbatimChar"/>
-          <w:rFonts w:ascii="Consolas" w:hAnsi="Consolas"/>
-        </w:rPr>
-        <w:t xml:space="preserve">test_quantum_safe_scoring (test_navigator.TestCryptoAgilityCopilot.test_quantum_safe_scoring) ... ok</w:t>
-      </w:r>
-    </w:p>
-    <w:p>
-      <w:pPr>
-        <w:pStyle w:val="SourceCode"/>
-      </w:pPr>
-      <w:r>
-        <w:rPr>
-          <w:rStyle w:val="VerbatimChar"/>
-          <w:rFonts w:ascii="Consolas" w:hAnsi="Consolas"/>
-        </w:rPr>
-        <w:t xml:space="preserve">test_scoring_and_mosca_inequality (test_navigator.TestCryptoAgilityCopilot.test_scoring_and_mosca_inequality) ... ok</w:t>
-      </w:r>
-    </w:p>
-    <w:p>
-      <w:pPr>
-        <w:pStyle w:val="SourceCode"/>
-      </w:pPr>
-      <w:r>
-        <w:rPr>
-          <w:rStyle w:val="VerbatimChar"/>
-          <w:rFonts w:ascii="Consolas" w:hAnsi="Consolas"/>
-        </w:rPr>
-        <w:t xml:space="preserve">test_semantic_binding_discrimination (test_navigator.TestCryptoAgilityCopilot.test_semantic_binding_discrimination) ... ok</w:t>
+        <w:t xml:space="preserve">test_cbom_generation (test_navigator.TestCryptoAgilityNavigator.test_cbom_generation) ... ok</w:t>
+      </w:r>
+    </w:p>
+    <w:p>
+      <w:pPr>
+        <w:pStyle w:val="SourceCode"/>
+      </w:pPr>
+      <w:r>
+        <w:rPr>
+          <w:rStyle w:val="VerbatimChar"/>
+          <w:rFonts w:ascii="Consolas" w:hAnsi="Consolas"/>
+        </w:rPr>
+        <w:t xml:space="preserve">test_context_noise_suppression (test_navigator.TestCryptoAgilityNavigator.test_context_noise_suppression) ... ok</w:t>
+      </w:r>
+    </w:p>
+    <w:p>
+      <w:pPr>
+        <w:pStyle w:val="SourceCode"/>
+      </w:pPr>
+      <w:r>
+        <w:rPr>
+          <w:rStyle w:val="VerbatimChar"/>
+          <w:rFonts w:ascii="Consolas" w:hAnsi="Consolas"/>
+        </w:rPr>
+        <w:t xml:space="preserve">test_custom_code_snippet_analysis (test_navigator.TestCryptoAgilityNavigator.test_custom_code_snippet_analysis) ... ok</w:t>
+      </w:r>
+    </w:p>
+    <w:p>
+      <w:pPr>
+        <w:pStyle w:val="SourceCode"/>
+      </w:pPr>
+      <w:r>
+        <w:rPr>
+          <w:rStyle w:val="VerbatimChar"/>
+          <w:rFonts w:ascii="Consolas" w:hAnsi="Consolas"/>
+        </w:rPr>
+        <w:t xml:space="preserve">test_discovery_engine (test_navigator.TestCryptoAgilityNavigator.test_discovery_engine) ... ok</w:t>
+      </w:r>
+    </w:p>
+    <w:p>
+      <w:pPr>
+        <w:pStyle w:val="SourceCode"/>
+      </w:pPr>
+      <w:r>
+        <w:rPr>
+          <w:rStyle w:val="VerbatimChar"/>
+          <w:rFonts w:ascii="Consolas" w:hAnsi="Consolas"/>
+        </w:rPr>
+        <w:t xml:space="preserve">test_full_pipeline_ranking (test_navigator.TestCryptoAgilityNavigator.test_full_pipeline_ranking) ... ok</w:t>
+      </w:r>
+    </w:p>
+    <w:p>
+      <w:pPr>
+        <w:pStyle w:val="SourceCode"/>
+      </w:pPr>
+      <w:r>
+        <w:rPr>
+          <w:rStyle w:val="VerbatimChar"/>
+          <w:rFonts w:ascii="Consolas" w:hAnsi="Consolas"/>
+        </w:rPr>
+        <w:t xml:space="preserve">test_quantum_safe_scoring (test_navigator.TestCryptoAgilityNavigator.test_quantum_safe_scoring) ... ok</w:t>
+      </w:r>
+    </w:p>
+    <w:p>
+      <w:pPr>
+        <w:pStyle w:val="SourceCode"/>
+      </w:pPr>
+      <w:r>
+        <w:rPr>
+          <w:rStyle w:val="VerbatimChar"/>
+          <w:rFonts w:ascii="Consolas" w:hAnsi="Consolas"/>
+        </w:rPr>
+        <w:t xml:space="preserve">test_scoring_and_mosca_inequality (test_navigator.TestCryptoAgilityNavigator.test_scoring_and_mosca_inequality) ... ok</w:t>
+      </w:r>
+    </w:p>
+    <w:p>
+      <w:pPr>
+        <w:pStyle w:val="SourceCode"/>
+      </w:pPr>
+      <w:r>
+        <w:rPr>
+          <w:rStyle w:val="VerbatimChar"/>
+          <w:rFonts w:ascii="Consolas" w:hAnsi="Consolas"/>
+        </w:rPr>
+        <w:t xml:space="preserve">test_semantic_binding_discrimination (test_navigator.TestCryptoAgilityNavigator.test_semantic_binding_discrimination) ... ok</w:t>
       </w:r>
     </w:p>
     <w:p>
@@ -10322,7 +10322,7 @@
         <w:t xml:space="preserve">typeshed</w:t>
       </w:r>
       <w:r>
-        <w:t xml:space="preserve">). Crucially, when an invocation's dataflow cannot be resolved statically, the copilot does not guess; it flags the finding in an explicit "insufficient context" audit bucket for security analysts, preserving transparent provenance.</w:t>
+        <w:t xml:space="preserve">). Crucially, when an invocation's dataflow cannot be resolved statically, the navigator does not guess; it flags the finding in an explicit "insufficient context" audit bucket for security analysts, preserving transparent provenance.</w:t>
       </w:r>
     </w:p>
     <w:p>

</xml_diff>